<commit_message>
added the Ashkelon race analysis
</commit_message>
<xml_diff>
--- a/Screenshots/הוראות/הוראות שימוש באפליקציה.docx
+++ b/Screenshots/הוראות/הוראות שימוש באפליקציה.docx
@@ -169,7 +169,6 @@
           <w:szCs w:val="32"/>
         </w:rPr>
       </w:pPr>
-      <w:proofErr w:type="spellStart"/>
       <w:r>
         <w:rPr>
           <w:b/>
@@ -178,17 +177,7 @@
           <w:szCs w:val="32"/>
         </w:rPr>
         <w:lastRenderedPageBreak/>
-        <w:t>Realtiming</w:t>
-      </w:r>
-      <w:proofErr w:type="spellEnd"/>
-      <w:r>
-        <w:rPr>
-          <w:b/>
-          <w:bCs/>
-          <w:sz w:val="32"/>
-          <w:szCs w:val="32"/>
-        </w:rPr>
-        <w:t>:</w:t>
+        <w:t>Realtiming:</w:t>
       </w:r>
     </w:p>
     <w:p>
@@ -424,9 +413,6 @@
       <w:pPr>
         <w:bidi w:val="0"/>
         <w:jc w:val="center"/>
-        <w:rPr>
-          <w:rtl/>
-        </w:rPr>
       </w:pPr>
       <w:r>
         <w:rPr>
@@ -440,11 +426,82 @@
     <w:p>
       <w:pPr>
         <w:bidi w:val="0"/>
+        <w:jc w:val="center"/>
+      </w:pPr>
+      <w:r>
+        <w:rPr>
+          <w:noProof/>
+        </w:rPr>
+        <w:drawing>
+          <wp:inline distT="0" distB="0" distL="0" distR="0" wp14:anchorId="75DE8237" wp14:editId="75F6C061">
+            <wp:extent cx="3009900" cy="2171700"/>
+            <wp:effectExtent l="0" t="0" r="0" b="0"/>
+            <wp:docPr id="1906637195" name="תמונה 1"/>
+            <wp:cNvGraphicFramePr>
+              <a:graphicFrameLocks xmlns:a="http://schemas.openxmlformats.org/drawingml/2006/main" noChangeAspect="1"/>
+            </wp:cNvGraphicFramePr>
+            <a:graphic xmlns:a="http://schemas.openxmlformats.org/drawingml/2006/main">
+              <a:graphicData uri="http://schemas.openxmlformats.org/drawingml/2006/picture">
+                <pic:pic xmlns:pic="http://schemas.openxmlformats.org/drawingml/2006/picture">
+                  <pic:nvPicPr>
+                    <pic:cNvPr id="0" name="Picture 1"/>
+                    <pic:cNvPicPr>
+                      <a:picLocks noChangeAspect="1" noChangeArrowheads="1"/>
+                    </pic:cNvPicPr>
+                  </pic:nvPicPr>
+                  <pic:blipFill>
+                    <a:blip r:embed="rId9">
+                      <a:extLst>
+                        <a:ext uri="{28A0092B-C50C-407E-A947-70E740481C1C}">
+                          <a14:useLocalDpi xmlns:a14="http://schemas.microsoft.com/office/drawing/2010/main" val="0"/>
+                        </a:ext>
+                      </a:extLst>
+                    </a:blip>
+                    <a:srcRect/>
+                    <a:stretch>
+                      <a:fillRect/>
+                    </a:stretch>
+                  </pic:blipFill>
+                  <pic:spPr bwMode="auto">
+                    <a:xfrm>
+                      <a:off x="0" y="0"/>
+                      <a:ext cx="3009900" cy="2171700"/>
+                    </a:xfrm>
+                    <a:prstGeom prst="rect">
+                      <a:avLst/>
+                    </a:prstGeom>
+                    <a:noFill/>
+                    <a:ln>
+                      <a:noFill/>
+                    </a:ln>
+                  </pic:spPr>
+                </pic:pic>
+              </a:graphicData>
+            </a:graphic>
+          </wp:inline>
+        </w:drawing>
+      </w:r>
+    </w:p>
+    <w:p>
+      <w:pPr>
+        <w:bidi w:val="0"/>
+        <w:jc w:val="right"/>
         <w:rPr>
           <w:rtl/>
         </w:rPr>
       </w:pPr>
+    </w:p>
+    <w:p>
+      <w:pPr>
+        <w:bidi w:val="0"/>
+        <w:rPr>
+          <w:rtl/>
+        </w:rPr>
+      </w:pPr>
       <w:r>
+        <w:rPr>
+          <w:noProof/>
+        </w:rPr>
         <w:drawing>
           <wp:inline distT="0" distB="0" distL="0" distR="0" wp14:anchorId="2712D55B" wp14:editId="42BA8FA3">
             <wp:extent cx="5274310" cy="2917825"/>
@@ -461,7 +518,7 @@
                     <pic:cNvPicPr/>
                   </pic:nvPicPr>
                   <pic:blipFill>
-                    <a:blip r:embed="rId9"/>
+                    <a:blip r:embed="rId10"/>
                     <a:stretch>
                       <a:fillRect/>
                     </a:stretch>
@@ -490,6 +547,9 @@
         </w:rPr>
       </w:pPr>
       <w:r>
+        <w:rPr>
+          <w:noProof/>
+        </w:rPr>
         <w:drawing>
           <wp:inline distT="0" distB="0" distL="0" distR="0" wp14:anchorId="5A793C86" wp14:editId="779306D5">
             <wp:extent cx="5274310" cy="2641600"/>
@@ -506,7 +566,7 @@
                     <pic:cNvPicPr/>
                   </pic:nvPicPr>
                   <pic:blipFill>
-                    <a:blip r:embed="rId10"/>
+                    <a:blip r:embed="rId11"/>
                     <a:stretch>
                       <a:fillRect/>
                     </a:stretch>
@@ -559,7 +619,7 @@
                     </pic:cNvPicPr>
                   </pic:nvPicPr>
                   <pic:blipFill>
-                    <a:blip r:embed="rId11">
+                    <a:blip r:embed="rId12">
                       <a:extLst>
                         <a:ext uri="{28A0092B-C50C-407E-A947-70E740481C1C}">
                           <a14:useLocalDpi xmlns:a14="http://schemas.microsoft.com/office/drawing/2010/main" val="0"/>
@@ -612,7 +672,7 @@
                     </pic:cNvPicPr>
                   </pic:nvPicPr>
                   <pic:blipFill>
-                    <a:blip r:embed="rId12">
+                    <a:blip r:embed="rId13">
                       <a:extLst>
                         <a:ext uri="{28A0092B-C50C-407E-A947-70E740481C1C}">
                           <a14:useLocalDpi xmlns:a14="http://schemas.microsoft.com/office/drawing/2010/main" val="0"/>
@@ -655,11 +715,74 @@
     <w:p>
       <w:pPr>
         <w:bidi w:val="0"/>
+      </w:pPr>
+    </w:p>
+    <w:p>
+      <w:pPr>
+        <w:bidi w:val="0"/>
+        <w:jc w:val="center"/>
+        <w:rPr>
+          <w:rtl/>
+        </w:rPr>
+      </w:pPr>
+      <w:r>
         <w:rPr>
           <w:rFonts w:hint="cs"/>
           <w:rtl/>
         </w:rPr>
-      </w:pPr>
+        <w:lastRenderedPageBreak/>
+        <w:t>לסגירת האפליקציה, סגור את החלון הזה:</w:t>
+      </w:r>
+    </w:p>
+    <w:p>
+      <w:pPr>
+        <w:bidi w:val="0"/>
+        <w:jc w:val="center"/>
+        <w:rPr>
+          <w:rFonts w:hint="cs"/>
+          <w:rtl/>
+        </w:rPr>
+      </w:pPr>
+      <w:r>
+        <w:rPr>
+          <w:noProof/>
+        </w:rPr>
+        <w:drawing>
+          <wp:inline distT="0" distB="0" distL="0" distR="0" wp14:anchorId="067B4B55" wp14:editId="62E4435C">
+            <wp:extent cx="5274310" cy="4798060"/>
+            <wp:effectExtent l="0" t="0" r="2540" b="2540"/>
+            <wp:docPr id="1016350913" name="תמונה 1"/>
+            <wp:cNvGraphicFramePr>
+              <a:graphicFrameLocks xmlns:a="http://schemas.openxmlformats.org/drawingml/2006/main" noChangeAspect="1"/>
+            </wp:cNvGraphicFramePr>
+            <a:graphic xmlns:a="http://schemas.openxmlformats.org/drawingml/2006/main">
+              <a:graphicData uri="http://schemas.openxmlformats.org/drawingml/2006/picture">
+                <pic:pic xmlns:pic="http://schemas.openxmlformats.org/drawingml/2006/picture">
+                  <pic:nvPicPr>
+                    <pic:cNvPr id="1016350913" name=""/>
+                    <pic:cNvPicPr/>
+                  </pic:nvPicPr>
+                  <pic:blipFill>
+                    <a:blip r:embed="rId14"/>
+                    <a:stretch>
+                      <a:fillRect/>
+                    </a:stretch>
+                  </pic:blipFill>
+                  <pic:spPr>
+                    <a:xfrm>
+                      <a:off x="0" y="0"/>
+                      <a:ext cx="5274310" cy="4798060"/>
+                    </a:xfrm>
+                    <a:prstGeom prst="rect">
+                      <a:avLst/>
+                    </a:prstGeom>
+                  </pic:spPr>
+                </pic:pic>
+              </a:graphicData>
+            </a:graphic>
+          </wp:inline>
+        </w:drawing>
+      </w:r>
     </w:p>
     <w:sectPr>
       <w:pgSz w:w="11906" w:h="16838"/>

</xml_diff>